<commit_message>
Complete AI suburb snapshot launch pack
</commit_message>
<xml_diff>
--- a/content/member-assets/realtor-suburb-snapshot/ai-automation-pack.docx
+++ b/content/member-assets/realtor-suburb-snapshot/ai-automation-pack.docx
@@ -39,7 +39,7 @@
         <w:pStyle w:val="Tagline"/>
       </w:pPr>
       <w:r>
-        <w:t xml:space="preserve">Real estate agents need local content every week.</w:t>
+        <w:t xml:space="preserve">Turn one suburb and one AI prompt into a report agents can publish.</w:t>
       </w:r>
     </w:p>
     <w:p>
@@ -759,7 +759,7 @@
               <w:pStyle w:val="TableCell"/>
             </w:pPr>
             <w:r>
-              <w:t xml:space="preserve">How to use these automations - Each automation below is a ready prompt you can paste into an AI agent (ChatGPT, Claude, or…</w:t>
+              <w:t xml:space="preserve">The easiest reliable stack - Research and drafting: ChatGPT, Claude, or another agent that can browse, open sources, and…</w:t>
             </w:r>
           </w:p>
         </w:tc>
@@ -801,7 +801,7 @@
               <w:pStyle w:val="TableCell"/>
             </w:pPr>
             <w:r>
-              <w:t xml:space="preserve">Automation schedule - Daily lead triage: every weekday morning.</w:t>
+              <w:t xml:space="preserve">Minimum viable delivery loop - 1. Trigger: the client row reaches its next reporting date.</w:t>
             </w:r>
           </w:p>
         </w:tc>
@@ -845,7 +845,7 @@
               <w:pStyle w:val="TableCell"/>
             </w:pPr>
             <w:r>
-              <w:t xml:space="preserve">Daily lead triage - runs every weekday morning - You are an intake assistant for a realtor suburb snapshot reports serving real estate…</w:t>
+              <w:t xml:space="preserve">Scheduled research-agent prompt - Read this client configuration: [CLIENT ROW]. Research the latest available property market…</w:t>
             </w:r>
           </w:p>
         </w:tc>
@@ -887,7 +887,7 @@
               <w:pStyle w:val="TableCell"/>
             </w:pPr>
             <w:r>
-              <w:t xml:space="preserve">Weekly prospect list - runs every Monday - You are a local lead researcher for a realtor suburb snapshot reports. Target buyer: Real…</w:t>
+              <w:t xml:space="preserve">Verification gate prompt - Open every URL in this source ledger: [PASTE LEDGER]. Return one row per figure with PASS…</w:t>
             </w:r>
           </w:p>
         </w:tc>
@@ -931,7 +931,7 @@
               <w:pStyle w:val="TableCell"/>
             </w:pPr>
             <w:r>
-              <w:t xml:space="preserve">Outreach drafting prompt - runs twice a week - You write first-contact outreach for a realtor suburb snapshot reports aimed at real estate…</w:t>
+              <w:t xml:space="preserve">Template mapping - Require fixed output keys: headline, reporting_period, metric_1 through metric_4, summary…</w:t>
             </w:r>
           </w:p>
         </w:tc>
@@ -973,7 +973,7 @@
               <w:pStyle w:val="TableCell"/>
             </w:pPr>
             <w:r>
-              <w:t xml:space="preserve">Follow-up sequencer prompt - runs every weekday - You manage polite follow-ups. Here are prospects with no reply and the days since first…</w:t>
+              <w:t xml:space="preserve">Approval email draft - Draft an email to [APPROVAL OWNER] for the [SUBURB] snapshot. Link the approval PDF, source…</w:t>
             </w:r>
           </w:p>
         </w:tc>
@@ -1017,7 +1017,7 @@
               <w:pStyle w:val="TableCell"/>
             </w:pPr>
             <w:r>
-              <w:t xml:space="preserve">Delivery QA prompt - runs before every handoff - You are a delivery reviewer for a realtor suburb snapshot reports. Here is the draft…</w:t>
+              <w:t xml:space="preserve">Monthly rerun rule - After named approval, set next_reporting_date to the agreed cadence and duplicate the…</w:t>
             </w:r>
           </w:p>
         </w:tc>
@@ -1059,7 +1059,7 @@
               <w:pStyle w:val="TableCell"/>
             </w:pPr>
             <w:r>
-              <w:t xml:space="preserve">Weekly report and client update - runs every Friday - You report on a realtor suburb snapshot reports. Here is this week's activity: [prospects…</w:t>
+              <w:t xml:space="preserve">Lead-finding automation - Once a week, research 10 active agents in [SUBURB] who post listings, open homes, or broad…</w:t>
             </w:r>
           </w:p>
         </w:tc>
@@ -1103,7 +1103,7 @@
               <w:pStyle w:val="TableCell"/>
             </w:pPr>
             <w:r>
-              <w:t xml:space="preserve">Proof and referral repurposing - runs after each completed job - You repurpose finished work for a realtor suburb snapshot reports. Here are the job details…</w:t>
+              <w:t xml:space="preserve">Failure and safety rules - Stop when browsing is unavailable, a source cannot be opened, sources conflict materially…</w:t>
             </w:r>
           </w:p>
         </w:tc>
@@ -1188,63 +1188,7 @@
         <w:pStyle w:val="Heading1"/>
       </w:pPr>
       <w:r>
-        <w:t xml:space="preserve">01 / How to use these automations</w:t>
-      </w:r>
-    </w:p>
-    <w:p>
-      <w:pPr>
-        <w:pStyle w:val="ListParagraph"/>
-        <w:numPr>
-          <w:ilvl w:val="0"/>
-          <w:numId w:val="1"/>
-        </w:numPr>
-      </w:pPr>
-      <w:r>
-        <w:t xml:space="preserve">Each automation below is a ready prompt you can paste into an AI agent (ChatGPT, Claude, or an agent platform) and run on a schedule.</w:t>
-      </w:r>
-    </w:p>
-    <w:p>
-      <w:pPr>
-        <w:pStyle w:val="ListParagraph"/>
-        <w:numPr>
-          <w:ilvl w:val="0"/>
-          <w:numId w:val="1"/>
-        </w:numPr>
-      </w:pPr>
-      <w:r>
-        <w:t xml:space="preserve">Give the agent only the inputs shown in [brackets], and keep a human approval step before anything is sent, published, or billed.</w:t>
-      </w:r>
-    </w:p>
-    <w:p>
-      <w:pPr>
-        <w:pStyle w:val="ListParagraph"/>
-        <w:numPr>
-          <w:ilvl w:val="0"/>
-          <w:numId w:val="1"/>
-        </w:numPr>
-      </w:pPr>
-      <w:r>
-        <w:t xml:space="preserve">Start with one automation, prove it for a week, then add the next so you learn to trust each output.</w:t>
-      </w:r>
-    </w:p>
-    <w:p>
-      <w:pPr>
-        <w:pStyle w:val="ListParagraph"/>
-        <w:numPr>
-          <w:ilvl w:val="0"/>
-          <w:numId w:val="1"/>
-        </w:numPr>
-      </w:pPr>
-      <w:r>
-        <w:t xml:space="preserve">Send each output to where you already work: inbox drafts, your CRM, or a shared job doc.</w:t>
-      </w:r>
-    </w:p>
-    <w:p>
-      <w:pPr>
-        <w:pStyle w:val="Heading1"/>
-      </w:pPr>
-      <w:r>
-        <w:t xml:space="preserve">02 / Automation schedule</w:t>
+        <w:t xml:space="preserve">01 / The easiest reliable stack</w:t>
       </w:r>
     </w:p>
     <w:tbl>
@@ -1283,7 +1227,7 @@
               <w:pStyle w:val="TableHeader"/>
             </w:pPr>
             <w:r>
-              <w:t xml:space="preserve">Automation</w:t>
+              <w:t xml:space="preserve">Field</w:t>
             </w:r>
           </w:p>
         </w:tc>
@@ -1304,7 +1248,7 @@
               <w:pStyle w:val="TableHeader"/>
             </w:pPr>
             <w:r>
-              <w:t xml:space="preserve">When to run</w:t>
+              <w:t xml:space="preserve">Detail</w:t>
             </w:r>
           </w:p>
         </w:tc>
@@ -1327,7 +1271,7 @@
               <w:pStyle w:val="TableLabel"/>
             </w:pPr>
             <w:r>
-              <w:t xml:space="preserve">Daily lead triage</w:t>
+              <w:t xml:space="preserve">Research and drafting</w:t>
             </w:r>
           </w:p>
         </w:tc>
@@ -1348,7 +1292,7 @@
               <w:pStyle w:val="TableCell"/>
             </w:pPr>
             <w:r>
-              <w:t xml:space="preserve">every weekday morning.</w:t>
+              <w:t xml:space="preserve">ChatGPT, Claude, or another agent that can browse, open sources, and return direct citations.</w:t>
             </w:r>
           </w:p>
         </w:tc>
@@ -1371,7 +1315,7 @@
               <w:pStyle w:val="TableLabel"/>
             </w:pPr>
             <w:r>
-              <w:t xml:space="preserve">Weekly prospect list</w:t>
+              <w:t xml:space="preserve">Client control sheet</w:t>
             </w:r>
           </w:p>
         </w:tc>
@@ -1391,7 +1335,7 @@
               <w:pStyle w:val="TableCell"/>
             </w:pPr>
             <w:r>
-              <w:t xml:space="preserve">every Monday.</w:t>
+              <w:t xml:space="preserve">one row per client in Google Sheets, Airtable, Notion, or your CRM with suburb, reporting date, audience, sources, tone, CTA, folder, and approval owner.</w:t>
             </w:r>
           </w:p>
         </w:tc>
@@ -1414,7 +1358,7 @@
               <w:pStyle w:val="TableLabel"/>
             </w:pPr>
             <w:r>
-              <w:t xml:space="preserve">Outreach drafting</w:t>
+              <w:t xml:space="preserve">Production</w:t>
             </w:r>
           </w:p>
         </w:tc>
@@ -1435,7 +1379,7 @@
               <w:pStyle w:val="TableCell"/>
             </w:pPr>
             <w:r>
-              <w:t xml:space="preserve">twice a week.</w:t>
+              <w:t xml:space="preserve">one reusable Canva or document template. The AI returns fixed fields so you paste or map the same blocks every run.</w:t>
             </w:r>
           </w:p>
         </w:tc>
@@ -1458,7 +1402,7 @@
               <w:pStyle w:val="TableLabel"/>
             </w:pPr>
             <w:r>
-              <w:t xml:space="preserve">Follow-up sequencer</w:t>
+              <w:t xml:space="preserve">Automation</w:t>
             </w:r>
           </w:p>
         </w:tc>
@@ -1478,138 +1422,7 @@
               <w:pStyle w:val="TableCell"/>
             </w:pPr>
             <w:r>
-              <w:t xml:space="preserve">every weekday.</w:t>
-            </w:r>
-          </w:p>
-        </w:tc>
-      </w:tr>
-      <w:tr>
-        <w:tc>
-          <w:tcPr>
-            <w:tcW w:w="3000" w:type="dxa"/>
-            <w:shd w:fill="F5F3F1"/>
-            <w:tcMar>
-              <w:top w:w="120" w:type="dxa"/>
-              <w:left w:w="150" w:type="dxa"/>
-              <w:bottom w:w="120" w:type="dxa"/>
-              <w:right w:w="150" w:type="dxa"/>
-            </w:tcMar>
-            <w:vAlign w:val="center"/>
-          </w:tcPr>
-          <w:p>
-            <w:pPr>
-              <w:pStyle w:val="TableLabel"/>
-            </w:pPr>
-            <w:r>
-              <w:t xml:space="preserve">Delivery QA</w:t>
-            </w:r>
-          </w:p>
-        </w:tc>
-        <w:tc>
-          <w:tcPr>
-            <w:tcW w:w="6180" w:type="dxa"/>
-            <w:shd w:fill="F5F3F1"/>
-            <w:tcMar>
-              <w:top w:w="120" w:type="dxa"/>
-              <w:left w:w="150" w:type="dxa"/>
-              <w:bottom w:w="120" w:type="dxa"/>
-              <w:right w:w="150" w:type="dxa"/>
-            </w:tcMar>
-            <w:vAlign w:val="center"/>
-          </w:tcPr>
-          <w:p>
-            <w:pPr>
-              <w:pStyle w:val="TableCell"/>
-            </w:pPr>
-            <w:r>
-              <w:t xml:space="preserve">before every handoff.</w:t>
-            </w:r>
-          </w:p>
-        </w:tc>
-      </w:tr>
-      <w:tr>
-        <w:tc>
-          <w:tcPr>
-            <w:tcW w:w="3000" w:type="dxa"/>
-            <w:shd w:fill="F5F3F1"/>
-            <w:tcMar>
-              <w:top w:w="120" w:type="dxa"/>
-              <w:left w:w="150" w:type="dxa"/>
-              <w:bottom w:w="120" w:type="dxa"/>
-              <w:right w:w="150" w:type="dxa"/>
-            </w:tcMar>
-            <w:vAlign w:val="center"/>
-          </w:tcPr>
-          <w:p>
-            <w:pPr>
-              <w:pStyle w:val="TableLabel"/>
-            </w:pPr>
-            <w:r>
-              <w:t xml:space="preserve">Weekly report and client update</w:t>
-            </w:r>
-          </w:p>
-        </w:tc>
-        <w:tc>
-          <w:tcPr>
-            <w:tcW w:w="6180" w:type="dxa"/>
-            <w:tcMar>
-              <w:top w:w="120" w:type="dxa"/>
-              <w:left w:w="150" w:type="dxa"/>
-              <w:bottom w:w="120" w:type="dxa"/>
-              <w:right w:w="150" w:type="dxa"/>
-            </w:tcMar>
-            <w:vAlign w:val="center"/>
-          </w:tcPr>
-          <w:p>
-            <w:pPr>
-              <w:pStyle w:val="TableCell"/>
-            </w:pPr>
-            <w:r>
-              <w:t xml:space="preserve">every Friday.</w:t>
-            </w:r>
-          </w:p>
-        </w:tc>
-      </w:tr>
-      <w:tr>
-        <w:tc>
-          <w:tcPr>
-            <w:tcW w:w="3000" w:type="dxa"/>
-            <w:shd w:fill="F5F3F1"/>
-            <w:tcMar>
-              <w:top w:w="120" w:type="dxa"/>
-              <w:left w:w="150" w:type="dxa"/>
-              <w:bottom w:w="120" w:type="dxa"/>
-              <w:right w:w="150" w:type="dxa"/>
-            </w:tcMar>
-            <w:vAlign w:val="center"/>
-          </w:tcPr>
-          <w:p>
-            <w:pPr>
-              <w:pStyle w:val="TableLabel"/>
-            </w:pPr>
-            <w:r>
-              <w:t xml:space="preserve">Proof and referral repurposing</w:t>
-            </w:r>
-          </w:p>
-        </w:tc>
-        <w:tc>
-          <w:tcPr>
-            <w:tcW w:w="6180" w:type="dxa"/>
-            <w:shd w:fill="F5F3F1"/>
-            <w:tcMar>
-              <w:top w:w="120" w:type="dxa"/>
-              <w:left w:w="150" w:type="dxa"/>
-              <w:bottom w:w="120" w:type="dxa"/>
-              <w:right w:w="150" w:type="dxa"/>
-            </w:tcMar>
-            <w:vAlign w:val="center"/>
-          </w:tcPr>
-          <w:p>
-            <w:pPr>
-              <w:pStyle w:val="TableCell"/>
-            </w:pPr>
-            <w:r>
-              <w:t xml:space="preserve">after each completed job.</w:t>
+              <w:t xml:space="preserve">Make, Zapier, or an agent schedule creates the research draft, saves files, and prepares the approval email. Keep verification and publishing human-controlled.</w:t>
             </w:r>
           </w:p>
         </w:tc>
@@ -1620,7 +1433,99 @@
         <w:pStyle w:val="Heading1"/>
       </w:pPr>
       <w:r>
-        <w:t xml:space="preserve">03 / Daily lead triage - runs every weekday morning</w:t>
+        <w:t xml:space="preserve">02 / Minimum viable delivery loop</w:t>
+      </w:r>
+    </w:p>
+    <w:p>
+      <w:pPr>
+        <w:pStyle w:val="ListParagraph"/>
+        <w:numPr>
+          <w:ilvl w:val="0"/>
+          <w:numId w:val="1"/>
+        </w:numPr>
+      </w:pPr>
+      <w:r>
+        <w:t xml:space="preserve">1. Trigger: the client row reaches its next reporting date.</w:t>
+      </w:r>
+    </w:p>
+    <w:p>
+      <w:pPr>
+        <w:pStyle w:val="ListParagraph"/>
+        <w:numPr>
+          <w:ilvl w:val="0"/>
+          <w:numId w:val="1"/>
+        </w:numPr>
+      </w:pPr>
+      <w:r>
+        <w:t xml:space="preserve">2. Research: the AI agent runs the one-prompt workflow for that suburb and reporting period.</w:t>
+      </w:r>
+    </w:p>
+    <w:p>
+      <w:pPr>
+        <w:pStyle w:val="ListParagraph"/>
+        <w:numPr>
+          <w:ilvl w:val="0"/>
+          <w:numId w:val="1"/>
+        </w:numPr>
+      </w:pPr>
+      <w:r>
+        <w:t xml:space="preserve">3. Gate: the workflow stops if a required figure is unverified, conflicting, stale, or inaccessible.</w:t>
+      </w:r>
+    </w:p>
+    <w:p>
+      <w:pPr>
+        <w:pStyle w:val="ListParagraph"/>
+        <w:numPr>
+          <w:ilvl w:val="0"/>
+          <w:numId w:val="1"/>
+        </w:numPr>
+      </w:pPr>
+      <w:r>
+        <w:t xml:space="preserve">4. Human verify: open the cited sources and approve or remove every proposed figure.</w:t>
+      </w:r>
+    </w:p>
+    <w:p>
+      <w:pPr>
+        <w:pStyle w:val="ListParagraph"/>
+        <w:numPr>
+          <w:ilvl w:val="0"/>
+          <w:numId w:val="1"/>
+        </w:numPr>
+      </w:pPr>
+      <w:r>
+        <w:t xml:space="preserve">5. Package: map the verified fields into the report template and create the email and social files.</w:t>
+      </w:r>
+    </w:p>
+    <w:p>
+      <w:pPr>
+        <w:pStyle w:val="ListParagraph"/>
+        <w:numPr>
+          <w:ilvl w:val="0"/>
+          <w:numId w:val="1"/>
+        </w:numPr>
+      </w:pPr>
+      <w:r>
+        <w:t xml:space="preserve">6. Client approve: prepare one bundled approval email; do not send or publish audience content automatically.</w:t>
+      </w:r>
+    </w:p>
+    <w:p>
+      <w:pPr>
+        <w:pStyle w:val="ListParagraph"/>
+        <w:numPr>
+          <w:ilvl w:val="0"/>
+          <w:numId w:val="1"/>
+        </w:numPr>
+      </w:pPr>
+      <w:r>
+        <w:t xml:space="preserve">7. Repeat: after approval, update the next reporting date and retain the source ledger with the final files.</w:t>
+      </w:r>
+    </w:p>
+    <w:p>
+      <w:pPr>
+        <w:pStyle w:val="Heading1"/>
+      </w:pPr>
+      <w:r>
+        <w:t xml:space="preserve">03 / Scheduled research-agent prompt</w:t>
       </w:r>
     </w:p>
     <w:p>
@@ -1628,7 +1533,7 @@
         <w:pStyle w:val="ExampleBlock"/>
       </w:pPr>
       <w:r>
-        <w:t xml:space="preserve">You are an intake assistant for a realtor suburb snapshot reports serving real estate agents. Here are the new enquiries from the last 24 hours: [paste messages]. For each one, return a row with: sender, channel, intent (new job / question / complaint / spam), urgency (high/medium/low), the single missing detail to ask for, and a one-line suggested reply. Do not send anything. Put any urgent or safety-related message at the top for immediate human review.</w:t>
+        <w:t xml:space="preserve">Read this client configuration: [CLIENT ROW]. Research the latest available property market data for the configured suburb and reporting period using credible public sources you can open. Cite every figure with a direct URL, source name, reporting date, geography, property type, and metric definition. Label inaccessible, conflicting, stale, or uncertain figures UNVERIFIED and exclude them from client-facing copy. Do not estimate, forecast, value property, give investment advice, or promise leads. Produce a source ledger, one-page snapshot fields, three talking points, one client email, three social posts, and an approval list. Save the output to [CLIENT FOLDER] as [SUBURB]-draft-[REPORTING DATE]. Do not email, publish, or overwrite an approved file.</w:t>
       </w:r>
     </w:p>
     <w:p>
@@ -1636,7 +1541,7 @@
         <w:pStyle w:val="Heading1"/>
       </w:pPr>
       <w:r>
-        <w:t xml:space="preserve">04 / Weekly prospect list - runs every Monday</w:t>
+        <w:t xml:space="preserve">04 / Verification gate prompt</w:t>
       </w:r>
     </w:p>
     <w:p>
@@ -1644,7 +1549,7 @@
         <w:pStyle w:val="ExampleBlock"/>
       </w:pPr>
       <w:r>
-        <w:t xml:space="preserve">You are a local lead researcher for a realtor suburb snapshot reports. Target buyer: Real estate agents. Using [area / suburb / list source], produce 10 prospects who visibly have the problem this service solves. Return a table: name, location, the visible problem you would reference, the best first channel, and a one-line opener. Exclude anyone who looks high-risk, delicate, or out of scope.</w:t>
+        <w:t xml:space="preserve">Open every URL in this source ledger: [PASTE LEDGER]. Return one row per figure with PASS, FAIL, STALE, CONFLICT, or CANNOT ACCESS. Compare the exact source wording, period, geography, property type, and metric definition. Remove failed figures from the draft and list the remaining items for human verification. Do not invent a replacement number. If fewer than three useful figures pass, stop the workflow and request human review.</w:t>
       </w:r>
     </w:p>
     <w:p>
@@ -1652,7 +1557,7 @@
         <w:pStyle w:val="Heading1"/>
       </w:pPr>
       <w:r>
-        <w:t xml:space="preserve">05 / Outreach drafting prompt - runs twice a week</w:t>
+        <w:t xml:space="preserve">05 / Template mapping</w:t>
       </w:r>
     </w:p>
     <w:p>
@@ -1660,7 +1565,31 @@
         <w:pStyle w:val="ExampleBlock"/>
       </w:pPr>
       <w:r>
-        <w:t xml:space="preserve">You write first-contact outreach for a realtor suburb snapshot reports aimed at real estate agents. Here is the prospect list: [paste rows]. For each prospect, draft a short, specific message that names the visible problem, offers the fixed-scope starter, and asks one easy yes/no question. Keep it under 90 words, with no hype and no guarantees. Return each draft labelled by prospect for human review before sending.</w:t>
+        <w:t xml:space="preserve">Require fixed output keys: headline, reporting_period, metric_1 through metric_4, summary, talking_point_1 through talking_point_3, source_footer, email, social_1 through social_3, agent_cta, approval_items.</w:t>
+      </w:r>
+    </w:p>
+    <w:p>
+      <w:pPr>
+        <w:pStyle w:val="ListParagraph"/>
+        <w:numPr>
+          <w:ilvl w:val="0"/>
+          <w:numId w:val="1"/>
+        </w:numPr>
+      </w:pPr>
+      <w:r>
+        <w:t xml:space="preserve">Map only verified fields into the Canva, Google Docs, or document-generation template. Never let the layout step research or rewrite facts.</w:t>
+      </w:r>
+    </w:p>
+    <w:p>
+      <w:pPr>
+        <w:pStyle w:val="ListParagraph"/>
+        <w:numPr>
+          <w:ilvl w:val="0"/>
+          <w:numId w:val="1"/>
+        </w:numPr>
+      </w:pPr>
+      <w:r>
+        <w:t xml:space="preserve">Export an approval PDF, preserve the editable template link, and save both beside the source ledger.</w:t>
       </w:r>
     </w:p>
     <w:p>
@@ -1668,7 +1597,7 @@
         <w:pStyle w:val="Heading1"/>
       </w:pPr>
       <w:r>
-        <w:t xml:space="preserve">06 / Follow-up sequencer prompt - runs every weekday</w:t>
+        <w:t xml:space="preserve">06 / Approval email draft</w:t>
       </w:r>
     </w:p>
     <w:p>
@@ -1676,7 +1605,7 @@
         <w:pStyle w:val="ExampleBlock"/>
       </w:pPr>
       <w:r>
-        <w:t xml:space="preserve">You manage polite follow-ups. Here are prospects with no reply and the days since first contact: [paste]. For each, draft the next message based on the gap: day 2 adds one new observation or sample, day 5 asks if it is handled internally, day 10 offers a smaller paid starter, day 21 closes the loop. Group drafts by prospect, never chase more than four times, and hold anything that should get a personal human note.</w:t>
+        <w:t xml:space="preserve">Draft an email to [APPROVAL OWNER] for the [SUBURB] snapshot. Link the approval PDF, source ledger, email copy, and social copy. Summarise the reporting period and list only the items that need a decision. Ask for APPROVED, CHANGES, or HOLD. State clearly that nothing will be published before approval. Save as a draft; do not send.</w:t>
       </w:r>
     </w:p>
     <w:p>
@@ -1684,7 +1613,51 @@
         <w:pStyle w:val="Heading1"/>
       </w:pPr>
       <w:r>
-        <w:t xml:space="preserve">07 / Delivery QA prompt - runs before every handoff</w:t>
+        <w:t xml:space="preserve">07 / Monthly rerun rule</w:t>
+      </w:r>
+    </w:p>
+    <w:p>
+      <w:pPr>
+        <w:pStyle w:val="ListParagraph"/>
+        <w:numPr>
+          <w:ilvl w:val="0"/>
+          <w:numId w:val="1"/>
+        </w:numPr>
+      </w:pPr>
+      <w:r>
+        <w:t xml:space="preserve">After named approval, set next_reporting_date to the agreed cadence and duplicate the previous job as a new draft record.</w:t>
+      </w:r>
+    </w:p>
+    <w:p>
+      <w:pPr>
+        <w:pStyle w:val="ListParagraph"/>
+        <w:numPr>
+          <w:ilvl w:val="0"/>
+          <w:numId w:val="1"/>
+        </w:numPr>
+      </w:pPr>
+      <w:r>
+        <w:t xml:space="preserve">Carry forward the client brief, source preferences, design template, CTA, and approval owner. Change only the reporting date and any newly approved campaign notes.</w:t>
+      </w:r>
+    </w:p>
+    <w:p>
+      <w:pPr>
+        <w:pStyle w:val="ListParagraph"/>
+        <w:numPr>
+          <w:ilvl w:val="0"/>
+          <w:numId w:val="1"/>
+        </w:numPr>
+      </w:pPr>
+      <w:r>
+        <w:t xml:space="preserve">Never reuse last month's numbers or source dates. Every run creates a fresh source ledger.</w:t>
+      </w:r>
+    </w:p>
+    <w:p>
+      <w:pPr>
+        <w:pStyle w:val="Heading1"/>
+      </w:pPr>
+      <w:r>
+        <w:t xml:space="preserve">08 / Lead-finding automation</w:t>
       </w:r>
     </w:p>
     <w:p>
@@ -1692,7 +1665,19 @@
         <w:pStyle w:val="ExampleBlock"/>
       </w:pPr>
       <w:r>
-        <w:t xml:space="preserve">You are a delivery reviewer for a realtor suburb snapshot reports. Here is the draft deliverable: [paste]. Check it against this standard: every fact, price, date, and claim is verifiable; nothing promises guaranteed results; the buyer can act within 30 seconds; every bracketed placeholder is replaced. Return a pass/fix list with the exact lines to change, then return it to the human owner instead of sending.</w:t>
+        <w:t xml:space="preserve">Once a week, research 10 active agents in [SUBURB] who post listings, open homes, or broad market updates but do not appear to publish a consistent source-backed suburb snapshot. Return agent, agency, visible evidence, profile URL, contact channel, and one specific sample angle. Do not scrape private data or send outreach.</w:t>
+      </w:r>
+    </w:p>
+    <w:p>
+      <w:pPr>
+        <w:pStyle w:val="ListParagraph"/>
+        <w:numPr>
+          <w:ilvl w:val="0"/>
+          <w:numId w:val="1"/>
+        </w:numPr>
+      </w:pPr>
+      <w:r>
+        <w:t xml:space="preserve">For the three strongest prospects, draft a message under 70 words offering to send a one-page sample. Keep every message in drafts for human review.</w:t>
       </w:r>
     </w:p>
     <w:p>
@@ -1700,31 +1685,43 @@
         <w:pStyle w:val="Heading1"/>
       </w:pPr>
       <w:r>
-        <w:t xml:space="preserve">08 / Weekly report and client update - runs every Friday</w:t>
-      </w:r>
-    </w:p>
-    <w:p>
-      <w:pPr>
-        <w:pStyle w:val="ExampleBlock"/>
-      </w:pPr>
-      <w:r>
-        <w:t xml:space="preserve">You report on a realtor suburb snapshot reports. Here is this week's activity: [prospects contacted, replies, jobs booked, jobs delivered, revenue, issues]. Produce two outputs: (1) an internal summary with the top three numbers and the one bottleneck to fix next week; (2) a short, friendly update for each active client stating what was done, what is next, and any approval needed. Keep every claim factual and flag anything that needs owner approval.</w:t>
-      </w:r>
-    </w:p>
-    <w:p>
-      <w:pPr>
-        <w:pStyle w:val="Heading1"/>
-      </w:pPr>
-      <w:r>
-        <w:t xml:space="preserve">09 / Proof and referral repurposing - runs after each completed job</w:t>
-      </w:r>
-    </w:p>
-    <w:p>
-      <w:pPr>
-        <w:pStyle w:val="ExampleBlock"/>
-      </w:pPr>
-      <w:r>
-        <w:t xml:space="preserve">You repurpose finished work for a realtor suburb snapshot reports. Here are the job details and before/after notes: [paste]. Draft: one social caption with the result and a soft call to action, one short message asking the client for a referral or review, and one line to add this example to the outreach sample library. Do not invent results or show identifying details without approval.</w:t>
+        <w:t xml:space="preserve">09 / Failure and safety rules</w:t>
+      </w:r>
+    </w:p>
+    <w:p>
+      <w:pPr>
+        <w:pStyle w:val="ListParagraph"/>
+        <w:numPr>
+          <w:ilvl w:val="0"/>
+          <w:numId w:val="1"/>
+        </w:numPr>
+      </w:pPr>
+      <w:r>
+        <w:t xml:space="preserve">Stop when browsing is unavailable, a source cannot be opened, sources conflict materially, the requested copy sounds like a valuation or forecast, or the approval owner is missing.</w:t>
+      </w:r>
+    </w:p>
+    <w:p>
+      <w:pPr>
+        <w:pStyle w:val="ListParagraph"/>
+        <w:numPr>
+          <w:ilvl w:val="0"/>
+          <w:numId w:val="1"/>
+        </w:numPr>
+      </w:pPr>
+      <w:r>
+        <w:t xml:space="preserve">Do not automate public posting, client-audience email sends, valuations, investment recommendations, appraisal claims, or guaranteed-performance language.</w:t>
+      </w:r>
+    </w:p>
+    <w:p>
+      <w:pPr>
+        <w:pStyle w:val="ListParagraph"/>
+        <w:numPr>
+          <w:ilvl w:val="0"/>
+          <w:numId w:val="1"/>
+        </w:numPr>
+      </w:pPr>
+      <w:r>
+        <w:t xml:space="preserve">Log the model, run date, source URLs, verification result, human verifier, client approval, and final filename for every delivery.</w:t>
       </w:r>
     </w:p>
     <w:p>

</xml_diff>